<commit_message>
Science Layer added and minor fixes
</commit_message>
<xml_diff>
--- a/docs/Energy Era Documentation.docx
+++ b/docs/Energy Era Documentation.docx
@@ -2025,7 +2025,7 @@
         </w:rPr>
       </w:pPr>
       <w:r>
-        <w:t>Algorithm Upgrades criam o primeiro reset manual relevante. Quando pesquisados manualmente, completam instantaneamente. Eles dobram a producao do CRC, resetam Improvements e aumentam o requisito do proximo upgrade. Se forem automatizados por uma tecnologia futura, usam o tempo de pesquisa configurado, atualmente com base de 10 segundos e crescimento suavizado.</w:t>
+        <w:t>Algorithm Upgrades criam o primeiro reset manual relevante. Quando pesquisados manualmente, completam instantaneamente. Eles dobram a producao do CRC, resetam Improvements e aumentam o requisito do proximo Upgrade. Com o perk 50G Calculator, usam o tempo de execucao configurado, atualmente com base de 10 segundos e crescimento suavizado a cada Upgrade.</w:t>
       </w:r>
     </w:p>
     <w:p>
@@ -2748,7 +2748,7 @@
         <w:rPr>
           <w:lang w:val="pt-BR"/>
         </w:rPr>
-        <w:t xml:space="preserve">A </w:t>
+        <w:t>A Science Era representa a segunda grande era de progressao de The Eternal Simulation. Tem sua propria tab, dividida em 2 subtabs: Science Devices e Science Tree. Depois da primeira sintese, Science Devices reune o Particle Sintetizer e as Quarks Cages.</w:t>
       </w:r>
       <w:r>
         <w:rPr>
@@ -2756,13 +2756,11 @@
           <w:bCs/>
           <w:lang w:val="pt-BR"/>
         </w:rPr>
-        <w:t>Science Era</w:t>
-      </w:r>
-      <w:r>
-        <w:rPr>
-          <w:lang w:val="pt-BR"/>
-        </w:rPr>
-        <w:t xml:space="preserve"> representa a segunda grande era de progressão de </w:t>
+      </w:r>
+      <w:r>
+        <w:rPr>
+          <w:lang w:val="pt-BR"/>
+        </w:rPr>
       </w:r>
       <w:r>
         <w:rPr>
@@ -2770,19 +2768,16 @@
           <w:iCs/>
           <w:lang w:val="pt-BR"/>
         </w:rPr>
-        <w:t>The Eternal Simulation</w:t>
-      </w:r>
-      <w:r>
-        <w:rPr>
-          <w:lang w:val="pt-BR"/>
-        </w:rPr>
-        <w:t>.</w:t>
-      </w:r>
-      <w:r>
-        <w:rPr>
-          <w:lang w:val="pt-BR"/>
-        </w:rPr>
-        <w:t xml:space="preserve"> Tem sua propria tab, dividida em 2 subtabs: Science Devices e Science Tree. Science Devices possui somente Quarks Cage.</w:t>
+      </w:r>
+      <w:r>
+        <w:rPr>
+          <w:lang w:val="pt-BR"/>
+        </w:rPr>
+      </w:r>
+      <w:r>
+        <w:rPr>
+          <w:lang w:val="pt-BR"/>
+        </w:rPr>
       </w:r>
     </w:p>
     <w:p>
@@ -3227,7 +3222,7 @@
         <w:rPr>
           <w:lang w:val="pt-BR"/>
         </w:rPr>
-        <w:t>A ativação realiza um prestige, reiniciando o progresso da Energy Era conforme as regras de reset.</w:t>
+        <w:t>A ativacao abre uma confirmacao com os Science Points e Quarks que serao ganhos antes de realizar o prestige. Na primeira sintese, a confirmacao transita para uma narrativa curta sobre a ativacao, a sobrecarga e o reset da instalacao, seguida de uma introducao a Science Era.</w:t>
       </w:r>
     </w:p>
     <w:p>
@@ -5298,7 +5293,7 @@
         <w:rPr>
           <w:lang w:val="pt-BR"/>
         </w:rPr>
-        <w:t>Quarks Cages aumentam a capacidade estável total.</w:t>
+        <w:t>Cada Quarks Cage aumenta a capacidade estavel total em 10 quarks.</w:t>
       </w:r>
     </w:p>
     <w:p>
@@ -5352,7 +5347,7 @@
         <w:rPr>
           <w:lang w:val="pt-BR"/>
         </w:rPr>
-        <w:t>A capacidade deve crescer de forma significativa a cada nova Cage.</w:t>
+        <w:t>A capacidade cresce linearmente em 10 quarks por Cage.</w:t>
       </w:r>
     </w:p>
     <w:p>
@@ -5986,7 +5981,7 @@
         <w:rPr>
           <w:lang w:val="pt-BR"/>
         </w:rPr>
-        <w:t>Fórmula candidata para capacidade:</w:t>
+        <w:t>Formula definida para capacidade:</w:t>
       </w:r>
     </w:p>
     <w:p>
@@ -6001,7 +5996,7 @@
         <w:rPr>
           <w:lang w:val="pt-BR"/>
         </w:rPr>
-        <w:t>Quark Capacity = 2^(Cages Owned + 1) - 1</w:t>
+        <w:t>Quark Capacity = 1 + 10 * Cages Owned</w:t>
       </w:r>
     </w:p>
     <w:p>
@@ -6040,7 +6035,7 @@
         <w:rPr>
           <w:lang w:val="pt-BR"/>
         </w:rPr>
-        <w:t>Ambas são fórmulas iniciais para testes, não valores finais de balanceamento.</w:t>
+        <w:t>A formula de custo permanece experimental; a capacidade de 10 quarks por Cage e a regra atual de teste.</w:t>
       </w:r>
     </w:p>
     <w:p>
@@ -6795,7 +6790,7 @@
         <w:ind w:left="259"/>
       </w:pPr>
       <w:r>
-        <w:t>Effect: Calculator automatizes A. Upgrades, without speed bonus. Automated A. Upgrades use the timed research route and applicable study speed multipliers; manual A. Upgrades remain instant.</w:t>
+        <w:t>Effect: Calculator automatizes A. Upgrades, with an execution time that increases per Upgrade. Manual A. Upgrades remain instant; automated A. Upgrades use the configured duration curve.</w:t>
       </w:r>
     </w:p>
     <w:p>
@@ -8462,12 +8457,12 @@
     </w:p>
     <w:p>
       <w:r>
-        <w:t>Implementado para teste: custo dinamico de Science Points pela formula V2, geracao de quarks por energia disponivel no ato da sintese, contadores de quarks, decay de quarks acima da capacidade segura, Quarks Cage como Science Device comprado com Stored Energy, subtabs Science Tree e Science Devices, e reset da Energy Era preservando recursos persistentes.</w:t>
-      </w:r>
-    </w:p>
-    <w:p>
-      <w:r>
-        <w:t>Regra alterada: Algorithm Upgrades manuais nao possuem tempo de pesquisa. O tempo configurado de Algorithm Upgrade fica reservado para automacao direta futura, como 50G Calculator, e deve ser descrito nesses perks como uma rota automatizada temporizada.</w:t>
+        <w:t>Implementado para teste: custo dinamico de Science Points pela formula V2, geracao de quarks por energia disponivel no ato da sintese, contadores e decay de quarks, Quarks Cage com 10 quarks de capacidade por unidade, e reset da Energy Era. Antes da primeira sintese, a UI mostra somente Science Points e Total Quarks. Depois, mostra capacidade, decay, historico e ganhos da sintese sem exibir o custo do proximo SP. Toda ativacao exige confirmacao; a primeira inclui a narrativa de entrada, e o Particle Sintetizer passa para Science Devices.</w:t>
+      </w:r>
+    </w:p>
+    <w:p>
+      <w:r>
+        <w:t>Regra implementada: Algorithm Upgrades manuais nao possuem tempo de pesquisa. O perk 50G Calculator automatiza A. Upgrades usando a curva de tempo crescente por Upgrade.</w:t>
       </w:r>
     </w:p>
     <w:sectPr>

</xml_diff>